<commit_message>
Subscription proposal: lock decisions (prices editable, no trial, logo A, bright flat colours) + add tier comparison table
Co-Authored-By: Claude Opus 4.8 <noreply@anthropic.com>
</commit_message>
<xml_diff>
--- a/SUBSCRIPTION_PLAN.docx
+++ b/SUBSCRIPTION_PLAN.docx
@@ -911,482 +911,16 @@
     </w:p>
     <w:p>
       <w:r>
-        <w:t xml:space="preserve">Pricing is proposed, not final. We lock it once you are happy.</w:t>
-      </w:r>
-    </w:p>
-    <w:p>
-      <w:pPr>
-        <w:pStyle w:val="Heading2"/>
-      </w:pPr>
-      <w:r>
-        <w:t xml:space="preserve">4. Billing model (simple, hybrid)</w:t>
-      </w:r>
-    </w:p>
-    <w:p>
-      <w:pPr>
-        <w:numPr>
-          <w:ilvl w:val="0"/>
-          <w:numId w:val="1"/>
-        </w:numPr>
-      </w:pPr>
-      <w:r>
-        <w:rPr>
-          <w:b/>
-        </w:rPr>
-        <w:t xml:space="preserve">Flat monthly fee per tier</w:t>
-      </w:r>
-      <w:r>
-        <w:t xml:space="preserve"> (above), billed by Stripe.</w:t>
-      </w:r>
-    </w:p>
-    <w:p>
-      <w:pPr>
-        <w:numPr>
-          <w:ilvl w:val="0"/>
-          <w:numId w:val="1"/>
-        </w:numPr>
-      </w:pPr>
-      <w:r>
-        <w:rPr>
-          <w:b/>
-        </w:rPr>
-        <w:t xml:space="preserve">A fair-use AI allowance per tier</w:t>
-      </w:r>
-      <w:r>
-        <w:t xml:space="preserve"> (a number of mockups / live sites per month), so heavy users do not drain costs. Beyond it, cheap </w:t>
-      </w:r>
-      <w:r>
-        <w:rPr>
-          <w:b/>
-        </w:rPr>
-        <w:t xml:space="preserve">top-up credits</w:t>
-      </w:r>
-      <w:r>
-        <w:t xml:space="preserve"> (for example £12 for 50 extra mockups).</w:t>
-      </w:r>
-    </w:p>
-    <w:p>
-      <w:pPr>
-        <w:numPr>
-          <w:ilvl w:val="0"/>
-          <w:numId w:val="1"/>
-        </w:numPr>
-      </w:pPr>
-      <w:r>
-        <w:rPr>
-          <w:b/>
-        </w:rPr>
-        <w:t xml:space="preserve">Customers see "credits remaining", never raw API cost.</w:t>
-      </w:r>
-      <w:r>
-        <w:t xml:space="preserve"> The £ cost meter we built stays, but for you and Super Admin only.</w:t>
-      </w:r>
-    </w:p>
-    <w:p>
-      <w:pPr>
-        <w:numPr>
-          <w:ilvl w:val="0"/>
-          <w:numId w:val="1"/>
-        </w:numPr>
-      </w:pPr>
-      <w:r>
-        <w:rPr>
-          <w:b/>
-        </w:rPr>
-        <w:t xml:space="preserve">Annual option</w:t>
-      </w:r>
-      <w:r>
-        <w:t xml:space="preserve"> with two months free (improves cash flow, cuts churn).</w:t>
-      </w:r>
-    </w:p>
-    <w:p>
-      <w:pPr>
-        <w:numPr>
-          <w:ilvl w:val="0"/>
-          <w:numId w:val="1"/>
-        </w:numPr>
-      </w:pPr>
-      <w:r>
-        <w:rPr>
-          <w:b/>
-        </w:rPr>
-        <w:t xml:space="preserve">Founding members:</w:t>
-      </w:r>
-      <w:r>
-        <w:t xml:space="preserve"> the first 20 to 50 keep their rate </w:t>
-      </w:r>
-      <w:r>
-        <w:rPr>
-          <w:b/>
-        </w:rPr>
-        <w:t xml:space="preserve">for life</w:t>
-      </w:r>
-      <w:r>
-        <w:t xml:space="preserve"> in exchange for being case studies. Honour it permanently.</w:t>
-      </w:r>
-    </w:p>
-    <w:p>
-      <w:pPr>
-        <w:pStyle w:val="Heading2"/>
-      </w:pPr>
-      <w:r>
-        <w:t xml:space="preserve">5. Phase 1, Launch (get it out there, start charging, learn)</w:t>
-      </w:r>
-    </w:p>
-    <w:p>
-      <w:r>
-        <w:t xml:space="preserve">Goal: ship a payable product fast, prove people pay, see how they use it.</w:t>
-      </w:r>
-    </w:p>
-    <w:p>
-      <w:pPr>
-        <w:numPr>
-          <w:ilvl w:val="0"/>
-          <w:numId w:val="1"/>
-        </w:numPr>
-      </w:pPr>
-      <w:r>
-        <w:rPr>
-          <w:b/>
-        </w:rPr>
-        <w:t xml:space="preserve">Accounts:</w:t>
-      </w:r>
-      <w:r>
-        <w:t xml:space="preserve"> sign-up + login with </w:t>
-      </w:r>
-      <w:r>
-        <w:rPr>
-          <w:b/>
-        </w:rPr>
-        <w:t xml:space="preserve">Email and Google</w:t>
-      </w:r>
-      <w:r>
-        <w:t xml:space="preserve"> (Clerk).</w:t>
-      </w:r>
-    </w:p>
-    <w:p>
-      <w:pPr>
-        <w:numPr>
-          <w:ilvl w:val="0"/>
-          <w:numId w:val="1"/>
-        </w:numPr>
-      </w:pPr>
-      <w:r>
-        <w:rPr>
-          <w:b/>
-        </w:rPr>
-        <w:t xml:space="preserve">Payments:</w:t>
-      </w:r>
-      <w:r>
-        <w:t xml:space="preserve"> </w:t>
-      </w:r>
-      <w:r>
-        <w:rPr>
-          <w:b/>
-        </w:rPr>
-        <w:t xml:space="preserve">Stripe</w:t>
-      </w:r>
-      <w:r>
-        <w:t xml:space="preserve"> subscriptions for the 3 tiers, in £ and $, plus a </w:t>
-      </w:r>
-      <w:r>
-        <w:rPr>
-          <w:b/>
-        </w:rPr>
-        <w:t xml:space="preserve">free trial</w:t>
-      </w:r>
-      <w:r>
-        <w:t xml:space="preserve"> (for example 7 days, or "25 leads + 3 mockups free") so they feel the website magic before paying.</w:t>
-      </w:r>
-    </w:p>
-    <w:p>
-      <w:pPr>
-        <w:numPr>
-          <w:ilvl w:val="0"/>
-          <w:numId w:val="1"/>
-        </w:numPr>
-      </w:pPr>
-      <w:r>
-        <w:rPr>
-          <w:b/>
-        </w:rPr>
-        <w:t xml:space="preserve">Per-customer data separation:</w:t>
-      </w:r>
-      <w:r>
-        <w:t xml:space="preserve"> each account only sees its own leads, mockups, sites, searches.</w:t>
-      </w:r>
-    </w:p>
-    <w:p>
-      <w:pPr>
-        <w:numPr>
-          <w:ilvl w:val="0"/>
-          <w:numId w:val="1"/>
-        </w:numPr>
-      </w:pPr>
-      <w:r>
-        <w:rPr>
-          <w:b/>
-        </w:rPr>
-        <w:t xml:space="preserve">Feature gating by plan:</w:t>
-      </w:r>
-      <w:r>
-        <w:t xml:space="preserve"> mockups locked to Hunter+, the live website builder locked to Apex.</w:t>
-      </w:r>
-    </w:p>
-    <w:p>
-      <w:pPr>
-        <w:numPr>
-          <w:ilvl w:val="0"/>
-          <w:numId w:val="1"/>
-        </w:numPr>
-      </w:pPr>
-      <w:r>
-        <w:rPr>
-          <w:b/>
-        </w:rPr>
-        <w:t xml:space="preserve">Credits, not raw cost,</w:t>
-      </w:r>
-      <w:r>
-        <w:t xml:space="preserve"> shown to customers.</w:t>
-      </w:r>
-    </w:p>
-    <w:p>
-      <w:pPr>
-        <w:numPr>
-          <w:ilvl w:val="0"/>
-          <w:numId w:val="1"/>
-        </w:numPr>
-      </w:pPr>
-      <w:r>
-        <w:rPr>
-          <w:b/>
-        </w:rPr>
-        <w:t xml:space="preserve">New light homepage + rebrand + new logo</w:t>
-      </w:r>
-      <w:r>
-        <w:t xml:space="preserve"> (see section 8).</w:t>
-      </w:r>
-    </w:p>
-    <w:p>
-      <w:pPr>
-        <w:numPr>
-          <w:ilvl w:val="0"/>
-          <w:numId w:val="1"/>
-        </w:numPr>
-      </w:pPr>
-      <w:r>
-        <w:rPr>
-          <w:b/>
-        </w:rPr>
-        <w:t xml:space="preserve">Minimal Super Admin:</w:t>
-      </w:r>
-      <w:r>
-        <w:t xml:space="preserve"> list customers, their tier, basic usage counts, suspend or change tier by hand.</w:t>
-      </w:r>
-    </w:p>
-    <w:p>
-      <w:pPr>
-        <w:numPr>
-          <w:ilvl w:val="0"/>
-          <w:numId w:val="1"/>
-        </w:numPr>
-      </w:pPr>
-      <w:r>
-        <w:rPr>
-          <w:b/>
-        </w:rPr>
-        <w:t xml:space="preserve">Founding-member offer</w:t>
-      </w:r>
-      <w:r>
-        <w:t xml:space="preserve"> wired to the existing apply funnel, with the lifetime grandfather.</w:t>
-      </w:r>
-    </w:p>
-    <w:p>
-      <w:pPr>
-        <w:pStyle w:val="Heading2"/>
-      </w:pPr>
-      <w:r>
-        <w:t xml:space="preserve">6. Phase 2, Grow (monetise deeper, understand customers)</w:t>
-      </w:r>
-    </w:p>
-    <w:p>
-      <w:pPr>
-        <w:numPr>
-          <w:ilvl w:val="0"/>
-          <w:numId w:val="1"/>
-        </w:numPr>
-      </w:pPr>
-      <w:r>
-        <w:rPr>
-          <w:b/>
-        </w:rPr>
-        <w:t xml:space="preserve">Super Admin analytics (PostHog + dashboards):</w:t>
-      </w:r>
-      <w:r>
-        <w:t xml:space="preserve"> what customers search for, their funnel (messaged to viewed to won), most-used features, churn and upsell signals.</w:t>
-      </w:r>
-    </w:p>
-    <w:p>
-      <w:pPr>
-        <w:numPr>
-          <w:ilvl w:val="0"/>
-          <w:numId w:val="1"/>
-        </w:numPr>
-      </w:pPr>
-      <w:r>
-        <w:rPr>
-          <w:b/>
-        </w:rPr>
-        <w:t xml:space="preserve">Usage limits enforced per tier + "upgrade to unlock"</w:t>
-      </w:r>
-      <w:r>
-        <w:t xml:space="preserve"> prompts.</w:t>
-      </w:r>
-    </w:p>
-    <w:p>
-      <w:pPr>
-        <w:numPr>
-          <w:ilvl w:val="0"/>
-          <w:numId w:val="1"/>
-        </w:numPr>
-      </w:pPr>
-      <w:r>
-        <w:rPr>
-          <w:b/>
-        </w:rPr>
-        <w:t xml:space="preserve">Top-up credits + annual billing + referrals.</w:t>
-      </w:r>
-    </w:p>
-    <w:p>
-      <w:pPr>
-        <w:numPr>
-          <w:ilvl w:val="0"/>
-          <w:numId w:val="1"/>
-        </w:numPr>
-      </w:pPr>
-      <w:r>
-        <w:rPr>
-          <w:b/>
-        </w:rPr>
-        <w:t xml:space="preserve">Close feature gaps versus rivals:</w:t>
-      </w:r>
-      <w:r>
-        <w:t xml:space="preserve"> email enrichment (find an email), and a </w:t>
-      </w:r>
-      <w:r>
-        <w:rPr>
-          <w:b/>
-        </w:rPr>
-        <w:t xml:space="preserve">Facebook lead source</w:t>
-      </w:r>
-      <w:r>
-        <w:t xml:space="preserve"> (LeadsGorilla has it, we do not yet).</w:t>
-      </w:r>
-    </w:p>
-    <w:p>
-      <w:pPr>
-        <w:numPr>
-          <w:ilvl w:val="0"/>
-          <w:numId w:val="1"/>
-        </w:numPr>
-      </w:pPr>
-      <w:r>
-        <w:t xml:space="preserve">Tighten the founding cohort into testimonials and case studies.</w:t>
-      </w:r>
-    </w:p>
-    <w:p>
-      <w:pPr>
-        <w:pStyle w:val="Heading2"/>
-      </w:pPr>
-      <w:r>
-        <w:t xml:space="preserve">7. Phase 3, Scale (build the moat)</w:t>
-      </w:r>
-    </w:p>
-    <w:p>
-      <w:pPr>
-        <w:numPr>
-          <w:ilvl w:val="0"/>
-          <w:numId w:val="1"/>
-        </w:numPr>
-      </w:pPr>
-      <w:r>
-        <w:rPr>
-          <w:b/>
-        </w:rPr>
-        <w:t xml:space="preserve">Full white-label:</w:t>
-      </w:r>
-      <w:r>
-        <w:t xml:space="preserve"> per-account branding, the customer's own agency name and colours everywhere, custom domains for previews and live sites.</w:t>
-      </w:r>
-    </w:p>
-    <w:p>
-      <w:pPr>
-        <w:numPr>
-          <w:ilvl w:val="0"/>
-          <w:numId w:val="1"/>
-        </w:numPr>
-      </w:pPr>
-      <w:r>
-        <w:rPr>
-          <w:b/>
-        </w:rPr>
-        <w:t xml:space="preserve">Team seats + roles</w:t>
-      </w:r>
-      <w:r>
-        <w:t xml:space="preserve"> (agencies with staff).</w:t>
-      </w:r>
-    </w:p>
-    <w:p>
-      <w:pPr>
-        <w:numPr>
-          <w:ilvl w:val="0"/>
-          <w:numId w:val="1"/>
-        </w:numPr>
-      </w:pPr>
-      <w:r>
-        <w:rPr>
-          <w:b/>
-        </w:rPr>
-        <w:t xml:space="preserve">Integrations:</w:t>
-      </w:r>
-      <w:r>
-        <w:t xml:space="preserve"> GoHighLevel, Zapier, a public API / webhooks.</w:t>
-      </w:r>
-    </w:p>
-    <w:p>
-      <w:pPr>
-        <w:numPr>
-          <w:ilvl w:val="0"/>
-          <w:numId w:val="1"/>
-        </w:numPr>
-      </w:pPr>
-      <w:r>
-        <w:rPr>
-          <w:b/>
-        </w:rPr>
-        <w:t xml:space="preserve">Done-for-you / marketplace</w:t>
-      </w:r>
-      <w:r>
-        <w:t xml:space="preserve"> add-ons for extra revenue (for example paid lead packs or managed campaigns).</w:t>
-      </w:r>
-    </w:p>
-    <w:p>
-      <w:pPr>
-        <w:numPr>
-          <w:ilvl w:val="0"/>
-          <w:numId w:val="1"/>
-        </w:numPr>
-      </w:pPr>
-      <w:r>
-        <w:t xml:space="preserve">Advanced AI: auto-outreach sequences, smarter follow-ups.</w:t>
-      </w:r>
-    </w:p>
-    <w:p>
-      <w:pPr>
-        <w:pStyle w:val="Heading2"/>
-      </w:pPr>
-      <w:r>
-        <w:t xml:space="preserve">8. Phase 1 brand + homepage refresh</w:t>
+        <w:t xml:space="preserve">Prices are kept in config so we can change them any time. Confirmed: </w:t>
+      </w:r>
+      <w:r>
+        <w:rPr>
+          <w:b/>
+        </w:rPr>
+        <w:t xml:space="preserve">no free trial at launch</w:t>
+      </w:r>
+      <w:r>
+        <w:t xml:space="preserve"> (we can add one later); the founding-member offer carries the early risk-reversal.</w:t>
       </w:r>
     </w:p>
     <w:p>
@@ -1394,304 +928,7 @@
         <w:pStyle w:val="Heading3"/>
       </w:pPr>
       <w:r>
-        <w:t xml:space="preserve">New homepage (simpler, lighter, ScrollyVid style)</w:t>
-      </w:r>
-    </w:p>
-    <w:p>
-      <w:pPr>
-        <w:numPr>
-          <w:ilvl w:val="0"/>
-          <w:numId w:val="1"/>
-        </w:numPr>
-      </w:pPr>
-      <w:r>
-        <w:t xml:space="preserve">A clean, </w:t>
-      </w:r>
-      <w:r>
-        <w:rPr>
-          <w:b/>
-        </w:rPr>
-        <w:t xml:space="preserve">light</w:t>
-      </w:r>
-      <w:r>
-        <w:t xml:space="preserve"> hero with the </w:t>
-      </w:r>
-      <w:r>
-        <w:rPr>
-          <w:b/>
-        </w:rPr>
-        <w:t xml:space="preserve">search front and centre and emphasised</w:t>
-      </w:r>
-      <w:r>
-        <w:t xml:space="preserve">, three simple fields:</w:t>
-      </w:r>
-    </w:p>
-    <w:p>
-      <w:pPr>
-        <w:numPr>
-          <w:ilvl w:val="0"/>
-          <w:numId w:val="1"/>
-        </w:numPr>
-      </w:pPr>
-      <w:r>
-        <w:rPr>
-          <w:b/>
-        </w:rPr>
-        <w:t xml:space="preserve">I am looking for</w:t>
-      </w:r>
-      <w:r>
-        <w:t xml:space="preserve"> (business type, for example electricians)</w:t>
-      </w:r>
-    </w:p>
-    <w:p>
-      <w:pPr>
-        <w:numPr>
-          <w:ilvl w:val="0"/>
-          <w:numId w:val="1"/>
-        </w:numPr>
-      </w:pPr>
-      <w:r>
-        <w:rPr>
-          <w:b/>
-        </w:rPr>
-        <w:t xml:space="preserve">Location</w:t>
-      </w:r>
-    </w:p>
-    <w:p>
-      <w:pPr>
-        <w:numPr>
-          <w:ilvl w:val="0"/>
-          <w:numId w:val="1"/>
-        </w:numPr>
-      </w:pPr>
-      <w:r>
-        <w:rPr>
-          <w:b/>
-        </w:rPr>
-        <w:t xml:space="preserve">Quick targeting toggles:</w:t>
-      </w:r>
-      <w:r>
-        <w:t xml:space="preserve"> "has a phone", "no website"</w:t>
-      </w:r>
-    </w:p>
-    <w:p>
-      <w:pPr>
-        <w:numPr>
-          <w:ilvl w:val="0"/>
-          <w:numId w:val="1"/>
-        </w:numPr>
-      </w:pPr>
-      <w:r>
-        <w:t xml:space="preserve">A big </w:t>
-      </w:r>
-      <w:r>
-        <w:rPr>
-          <w:b/>
-        </w:rPr>
-        <w:t xml:space="preserve">Find leads</w:t>
-      </w:r>
-      <w:r>
-        <w:t xml:space="preserve"> button</w:t>
-      </w:r>
-    </w:p>
-    <w:p>
-      <w:pPr>
-        <w:numPr>
-          <w:ilvl w:val="0"/>
-          <w:numId w:val="1"/>
-        </w:numPr>
-      </w:pPr>
-      <w:r>
-        <w:t xml:space="preserve">Below the hero: the value proposition (find no-website businesses, show them a website you built), a few proof points, the pricing, and sign-up. Logged-out visitors get a teaser then a prompt to start a free trial.</w:t>
-      </w:r>
-    </w:p>
-    <w:p>
-      <w:pPr>
-        <w:pStyle w:val="Heading3"/>
-      </w:pPr>
-      <w:r>
-        <w:t xml:space="preserve">Branding</w:t>
-      </w:r>
-    </w:p>
-    <w:p>
-      <w:pPr>
-        <w:numPr>
-          <w:ilvl w:val="0"/>
-          <w:numId w:val="1"/>
-        </w:numPr>
-      </w:pPr>
-      <w:r>
-        <w:rPr>
-          <w:b/>
-        </w:rPr>
-        <w:t xml:space="preserve">Default theme switches to LIGHT</w:t>
-      </w:r>
-      <w:r>
-        <w:t xml:space="preserve"> (today it is dark navy + gradients): bright, clean, professional.</w:t>
-      </w:r>
-    </w:p>
-    <w:p>
-      <w:pPr>
-        <w:numPr>
-          <w:ilvl w:val="0"/>
-          <w:numId w:val="1"/>
-        </w:numPr>
-      </w:pPr>
-      <w:r>
-        <w:t xml:space="preserve">Add a </w:t>
-      </w:r>
-      <w:r>
-        <w:rPr>
-          <w:b/>
-        </w:rPr>
-        <w:t xml:space="preserve">light / dark toggle</w:t>
-      </w:r>
-      <w:r>
-        <w:t xml:space="preserve">, default </w:t>
-      </w:r>
-      <w:r>
-        <w:rPr>
-          <w:b/>
-        </w:rPr>
-        <w:t xml:space="preserve">light</w:t>
-      </w:r>
-      <w:r>
-        <w:t xml:space="preserve">, the choice is remembered per user.</w:t>
-      </w:r>
-    </w:p>
-    <w:p>
-      <w:pPr>
-        <w:numPr>
-          <w:ilvl w:val="0"/>
-          <w:numId w:val="1"/>
-        </w:numPr>
-      </w:pPr>
-      <w:r>
-        <w:t xml:space="preserve">A fresh, </w:t>
-      </w:r>
-      <w:r>
-        <w:rPr>
-          <w:b/>
-        </w:rPr>
-        <w:t xml:space="preserve">flat accent colour</w:t>
-      </w:r>
-      <w:r>
-        <w:t xml:space="preserve"> (not the blue to mauve gradient).</w:t>
-      </w:r>
-    </w:p>
-    <w:p>
-      <w:pPr>
-        <w:pStyle w:val="Heading3"/>
-      </w:pPr>
-      <w:r>
-        <w:t xml:space="preserve">New logo</w:t>
-      </w:r>
-    </w:p>
-    <w:p>
-      <w:pPr>
-        <w:numPr>
-          <w:ilvl w:val="0"/>
-          <w:numId w:val="1"/>
-        </w:numPr>
-      </w:pPr>
-      <w:r>
-        <w:t xml:space="preserve">A </w:t>
-      </w:r>
-      <w:r>
-        <w:rPr>
-          <w:b/>
-        </w:rPr>
-        <w:t xml:space="preserve">flat, distinctive mark, not the typical gradient AI logo.</w:t>
-      </w:r>
-    </w:p>
-    <w:p>
-      <w:pPr>
-        <w:numPr>
-          <w:ilvl w:val="0"/>
-          <w:numId w:val="1"/>
-        </w:numPr>
-      </w:pPr>
-      <w:r>
-        <w:t xml:space="preserve">Direction options to choose from (I will mock these up):</w:t>
-      </w:r>
-    </w:p>
-    <w:p>
-      <w:pPr>
-        <w:numPr>
-          <w:ilvl w:val="0"/>
-          <w:numId w:val="1"/>
-        </w:numPr>
-      </w:pPr>
-      <w:r>
-        <w:t xml:space="preserve">A) A clean geometric </w:t>
-      </w:r>
-      <w:r>
-        <w:rPr>
-          <w:b/>
-        </w:rPr>
-        <w:t xml:space="preserve">pounce</w:t>
-      </w:r>
-      <w:r>
-        <w:t xml:space="preserve"> mark (a stylised paw or a downward pounce into a location pin).</w:t>
-      </w:r>
-    </w:p>
-    <w:p>
-      <w:pPr>
-        <w:numPr>
-          <w:ilvl w:val="0"/>
-          <w:numId w:val="1"/>
-        </w:numPr>
-      </w:pPr>
-      <w:r>
-        <w:t xml:space="preserve">B) A confident </w:t>
-      </w:r>
-      <w:r>
-        <w:rPr>
-          <w:b/>
-        </w:rPr>
-        <w:t xml:space="preserve">wordmark</w:t>
-      </w:r>
-      <w:r>
-        <w:t xml:space="preserve"> with one distinctive accent (for example a paw or pin replacing a letter).</w:t>
-      </w:r>
-    </w:p>
-    <w:p>
-      <w:pPr>
-        <w:numPr>
-          <w:ilvl w:val="0"/>
-          <w:numId w:val="1"/>
-        </w:numPr>
-      </w:pPr>
-      <w:r>
-        <w:t xml:space="preserve">C) A </w:t>
-      </w:r>
-      <w:r>
-        <w:rPr>
-          <w:b/>
-        </w:rPr>
-        <w:t xml:space="preserve">pin + paw fusion</w:t>
-      </w:r>
-      <w:r>
-        <w:t xml:space="preserve"> (lead-gen meets pounce).</w:t>
-      </w:r>
-    </w:p>
-    <w:p>
-      <w:pPr>
-        <w:numPr>
-          <w:ilvl w:val="0"/>
-          <w:numId w:val="1"/>
-        </w:numPr>
-      </w:pPr>
-      <w:r>
-        <w:t xml:space="preserve">Must work in light and dark and shrink to a favicon.</w:t>
-      </w:r>
-    </w:p>
-    <w:p>
-      <w:pPr>
-        <w:pStyle w:val="Heading2"/>
-      </w:pPr>
-      <w:r>
-        <w:t xml:space="preserve">9. Feature map by phase</w:t>
+        <w:t xml:space="preserve">Feature comparison (pricing-page style, like LeadsGorilla's)</w:t>
       </w:r>
     </w:p>
     <w:tbl>
@@ -1718,6 +955,1396 @@
               <w:rPr>
                 <w:b/>
               </w:rPr>
+              <w:t xml:space="preserve">Feature</w:t>
+            </w:r>
+          </w:p>
+        </w:tc>
+        <w:tc>
+          <w:tcPr>
+            <w:tcW w:w="0" w:type="auto"/>
+            <w:shd w:val="clear" w:fill="F0F2F5"/>
+          </w:tcPr>
+          <w:p>
+            <w:r>
+              <w:rPr>
+                <w:b/>
+              </w:rPr>
+              <w:t xml:space="preserve">Scout</w:t>
+            </w:r>
+          </w:p>
+        </w:tc>
+        <w:tc>
+          <w:tcPr>
+            <w:tcW w:w="0" w:type="auto"/>
+            <w:shd w:val="clear" w:fill="F0F2F5"/>
+          </w:tcPr>
+          <w:p>
+            <w:r>
+              <w:rPr>
+                <w:b/>
+              </w:rPr>
+              <w:t xml:space="preserve">Hunter</w:t>
+            </w:r>
+          </w:p>
+        </w:tc>
+        <w:tc>
+          <w:tcPr>
+            <w:tcW w:w="0" w:type="auto"/>
+            <w:shd w:val="clear" w:fill="F0F2F5"/>
+          </w:tcPr>
+          <w:p>
+            <w:r>
+              <w:rPr>
+                <w:b/>
+              </w:rPr>
+              <w:t xml:space="preserve">Apex</w:t>
+            </w:r>
+          </w:p>
+        </w:tc>
+      </w:tr>
+      <w:tr>
+        <w:tc>
+          <w:tcPr>
+            <w:tcW w:w="0" w:type="auto"/>
+          </w:tcPr>
+          <w:p>
+            <w:r>
+              <w:t xml:space="preserve">Find no-website local businesses</w:t>
+            </w:r>
+          </w:p>
+        </w:tc>
+        <w:tc>
+          <w:tcPr>
+            <w:tcW w:w="0" w:type="auto"/>
+          </w:tcPr>
+          <w:p>
+            <w:r>
+              <w:t xml:space="preserve">Yes</w:t>
+            </w:r>
+          </w:p>
+        </w:tc>
+        <w:tc>
+          <w:tcPr>
+            <w:tcW w:w="0" w:type="auto"/>
+          </w:tcPr>
+          <w:p>
+            <w:r>
+              <w:t xml:space="preserve">Yes</w:t>
+            </w:r>
+          </w:p>
+        </w:tc>
+        <w:tc>
+          <w:tcPr>
+            <w:tcW w:w="0" w:type="auto"/>
+          </w:tcPr>
+          <w:p>
+            <w:r>
+              <w:t xml:space="preserve">Yes</w:t>
+            </w:r>
+          </w:p>
+        </w:tc>
+      </w:tr>
+      <w:tr>
+        <w:tc>
+          <w:tcPr>
+            <w:tcW w:w="0" w:type="auto"/>
+          </w:tcPr>
+          <w:p>
+            <w:r>
+              <w:t xml:space="preserve">Leads found per month</w:t>
+            </w:r>
+          </w:p>
+        </w:tc>
+        <w:tc>
+          <w:tcPr>
+            <w:tcW w:w="0" w:type="auto"/>
+          </w:tcPr>
+          <w:p>
+            <w:r>
+              <w:t xml:space="preserve">2,000</w:t>
+            </w:r>
+          </w:p>
+        </w:tc>
+        <w:tc>
+          <w:tcPr>
+            <w:tcW w:w="0" w:type="auto"/>
+          </w:tcPr>
+          <w:p>
+            <w:r>
+              <w:t xml:space="preserve">10,000</w:t>
+            </w:r>
+          </w:p>
+        </w:tc>
+        <w:tc>
+          <w:tcPr>
+            <w:tcW w:w="0" w:type="auto"/>
+          </w:tcPr>
+          <w:p>
+            <w:r>
+              <w:t xml:space="preserve">Unlimited (fair use)</w:t>
+            </w:r>
+          </w:p>
+        </w:tc>
+      </w:tr>
+      <w:tr>
+        <w:tc>
+          <w:tcPr>
+            <w:tcW w:w="0" w:type="auto"/>
+          </w:tcPr>
+          <w:p>
+            <w:r>
+              <w:t xml:space="preserve">Call List, CRM + status, outreach (call / SMS / WhatsApp)</w:t>
+            </w:r>
+          </w:p>
+        </w:tc>
+        <w:tc>
+          <w:tcPr>
+            <w:tcW w:w="0" w:type="auto"/>
+          </w:tcPr>
+          <w:p>
+            <w:r>
+              <w:t xml:space="preserve">Yes</w:t>
+            </w:r>
+          </w:p>
+        </w:tc>
+        <w:tc>
+          <w:tcPr>
+            <w:tcW w:w="0" w:type="auto"/>
+          </w:tcPr>
+          <w:p>
+            <w:r>
+              <w:t xml:space="preserve">Yes</w:t>
+            </w:r>
+          </w:p>
+        </w:tc>
+        <w:tc>
+          <w:tcPr>
+            <w:tcW w:w="0" w:type="auto"/>
+          </w:tcPr>
+          <w:p>
+            <w:r>
+              <w:t xml:space="preserve">Yes</w:t>
+            </w:r>
+          </w:p>
+        </w:tc>
+      </w:tr>
+      <w:tr>
+        <w:tc>
+          <w:tcPr>
+            <w:tcW w:w="0" w:type="auto"/>
+          </w:tcPr>
+          <w:p>
+            <w:r>
+              <w:t xml:space="preserve">Engagement tracking + Performance dashboard</w:t>
+            </w:r>
+          </w:p>
+        </w:tc>
+        <w:tc>
+          <w:tcPr>
+            <w:tcW w:w="0" w:type="auto"/>
+          </w:tcPr>
+          <w:p>
+            <w:r>
+              <w:t xml:space="preserve">Yes</w:t>
+            </w:r>
+          </w:p>
+        </w:tc>
+        <w:tc>
+          <w:tcPr>
+            <w:tcW w:w="0" w:type="auto"/>
+          </w:tcPr>
+          <w:p>
+            <w:r>
+              <w:t xml:space="preserve">Yes</w:t>
+            </w:r>
+          </w:p>
+        </w:tc>
+        <w:tc>
+          <w:tcPr>
+            <w:tcW w:w="0" w:type="auto"/>
+          </w:tcPr>
+          <w:p>
+            <w:r>
+              <w:t xml:space="preserve">Yes</w:t>
+            </w:r>
+          </w:p>
+        </w:tc>
+      </w:tr>
+      <w:tr>
+        <w:tc>
+          <w:tcPr>
+            <w:tcW w:w="0" w:type="auto"/>
+          </w:tcPr>
+          <w:p>
+            <w:r>
+              <w:t xml:space="preserve">Message templates + per-template stats</w:t>
+            </w:r>
+          </w:p>
+        </w:tc>
+        <w:tc>
+          <w:tcPr>
+            <w:tcW w:w="0" w:type="auto"/>
+          </w:tcPr>
+          <w:p>
+            <w:r>
+              <w:t xml:space="preserve">Yes</w:t>
+            </w:r>
+          </w:p>
+        </w:tc>
+        <w:tc>
+          <w:tcPr>
+            <w:tcW w:w="0" w:type="auto"/>
+          </w:tcPr>
+          <w:p>
+            <w:r>
+              <w:t xml:space="preserve">Yes</w:t>
+            </w:r>
+          </w:p>
+        </w:tc>
+        <w:tc>
+          <w:tcPr>
+            <w:tcW w:w="0" w:type="auto"/>
+          </w:tcPr>
+          <w:p>
+            <w:r>
+              <w:t xml:space="preserve">Yes</w:t>
+            </w:r>
+          </w:p>
+        </w:tc>
+      </w:tr>
+      <w:tr>
+        <w:tc>
+          <w:tcPr>
+            <w:tcW w:w="0" w:type="auto"/>
+          </w:tcPr>
+          <w:p>
+            <w:r>
+              <w:t xml:space="preserve">Enquiry inbox</w:t>
+            </w:r>
+          </w:p>
+        </w:tc>
+        <w:tc>
+          <w:tcPr>
+            <w:tcW w:w="0" w:type="auto"/>
+          </w:tcPr>
+          <w:p>
+            <w:r>
+              <w:t xml:space="preserve">Yes</w:t>
+            </w:r>
+          </w:p>
+        </w:tc>
+        <w:tc>
+          <w:tcPr>
+            <w:tcW w:w="0" w:type="auto"/>
+          </w:tcPr>
+          <w:p>
+            <w:r>
+              <w:t xml:space="preserve">Yes</w:t>
+            </w:r>
+          </w:p>
+        </w:tc>
+        <w:tc>
+          <w:tcPr>
+            <w:tcW w:w="0" w:type="auto"/>
+          </w:tcPr>
+          <w:p>
+            <w:r>
+              <w:t xml:space="preserve">Yes</w:t>
+            </w:r>
+          </w:p>
+        </w:tc>
+      </w:tr>
+      <w:tr>
+        <w:tc>
+          <w:tcPr>
+            <w:tcW w:w="0" w:type="auto"/>
+          </w:tcPr>
+          <w:p>
+            <w:r>
+              <w:t xml:space="preserve">AI website mockups per month</w:t>
+            </w:r>
+          </w:p>
+        </w:tc>
+        <w:tc>
+          <w:tcPr>
+            <w:tcW w:w="0" w:type="auto"/>
+          </w:tcPr>
+          <w:p>
+            <w:r>
+              <w:t xml:space="preserve">No</w:t>
+            </w:r>
+          </w:p>
+        </w:tc>
+        <w:tc>
+          <w:tcPr>
+            <w:tcW w:w="0" w:type="auto"/>
+          </w:tcPr>
+          <w:p>
+            <w:r>
+              <w:t xml:space="preserve">250</w:t>
+            </w:r>
+          </w:p>
+        </w:tc>
+        <w:tc>
+          <w:tcPr>
+            <w:tcW w:w="0" w:type="auto"/>
+          </w:tcPr>
+          <w:p>
+            <w:r>
+              <w:t xml:space="preserve">1,000</w:t>
+            </w:r>
+          </w:p>
+        </w:tc>
+      </w:tr>
+      <w:tr>
+        <w:tc>
+          <w:tcPr>
+            <w:tcW w:w="0" w:type="auto"/>
+          </w:tcPr>
+          <w:p>
+            <w:r>
+              <w:t xml:space="preserve">Prowl AI call intelligence</w:t>
+            </w:r>
+          </w:p>
+        </w:tc>
+        <w:tc>
+          <w:tcPr>
+            <w:tcW w:w="0" w:type="auto"/>
+          </w:tcPr>
+          <w:p>
+            <w:r>
+              <w:t xml:space="preserve">No</w:t>
+            </w:r>
+          </w:p>
+        </w:tc>
+        <w:tc>
+          <w:tcPr>
+            <w:tcW w:w="0" w:type="auto"/>
+          </w:tcPr>
+          <w:p>
+            <w:r>
+              <w:t xml:space="preserve">Yes</w:t>
+            </w:r>
+          </w:p>
+        </w:tc>
+        <w:tc>
+          <w:tcPr>
+            <w:tcW w:w="0" w:type="auto"/>
+          </w:tcPr>
+          <w:p>
+            <w:r>
+              <w:t xml:space="preserve">Yes</w:t>
+            </w:r>
+          </w:p>
+        </w:tc>
+      </w:tr>
+      <w:tr>
+        <w:tc>
+          <w:tcPr>
+            <w:tcW w:w="0" w:type="auto"/>
+          </w:tcPr>
+          <w:p>
+            <w:r>
+              <w:t xml:space="preserve">Live website builder (Pounce)</w:t>
+            </w:r>
+          </w:p>
+        </w:tc>
+        <w:tc>
+          <w:tcPr>
+            <w:tcW w:w="0" w:type="auto"/>
+          </w:tcPr>
+          <w:p>
+            <w:r>
+              <w:t xml:space="preserve">No</w:t>
+            </w:r>
+          </w:p>
+        </w:tc>
+        <w:tc>
+          <w:tcPr>
+            <w:tcW w:w="0" w:type="auto"/>
+          </w:tcPr>
+          <w:p>
+            <w:r>
+              <w:t xml:space="preserve">No</w:t>
+            </w:r>
+          </w:p>
+        </w:tc>
+        <w:tc>
+          <w:tcPr>
+            <w:tcW w:w="0" w:type="auto"/>
+          </w:tcPr>
+          <w:p>
+            <w:r>
+              <w:t xml:space="preserve">Yes</w:t>
+            </w:r>
+          </w:p>
+        </w:tc>
+      </w:tr>
+      <w:tr>
+        <w:tc>
+          <w:tcPr>
+            <w:tcW w:w="0" w:type="auto"/>
+          </w:tcPr>
+          <w:p>
+            <w:r>
+              <w:t xml:space="preserve">Publish live + custom domains</w:t>
+            </w:r>
+          </w:p>
+        </w:tc>
+        <w:tc>
+          <w:tcPr>
+            <w:tcW w:w="0" w:type="auto"/>
+          </w:tcPr>
+          <w:p>
+            <w:r>
+              <w:t xml:space="preserve">No</w:t>
+            </w:r>
+          </w:p>
+        </w:tc>
+        <w:tc>
+          <w:tcPr>
+            <w:tcW w:w="0" w:type="auto"/>
+          </w:tcPr>
+          <w:p>
+            <w:r>
+              <w:t xml:space="preserve">No</w:t>
+            </w:r>
+          </w:p>
+        </w:tc>
+        <w:tc>
+          <w:tcPr>
+            <w:tcW w:w="0" w:type="auto"/>
+          </w:tcPr>
+          <w:p>
+            <w:r>
+              <w:t xml:space="preserve">Yes</w:t>
+            </w:r>
+          </w:p>
+        </w:tc>
+      </w:tr>
+      <w:tr>
+        <w:tc>
+          <w:tcPr>
+            <w:tcW w:w="0" w:type="auto"/>
+          </w:tcPr>
+          <w:p>
+            <w:r>
+              <w:t xml:space="preserve">White-label branding</w:t>
+            </w:r>
+          </w:p>
+        </w:tc>
+        <w:tc>
+          <w:tcPr>
+            <w:tcW w:w="0" w:type="auto"/>
+          </w:tcPr>
+          <w:p>
+            <w:r>
+              <w:t xml:space="preserve">No</w:t>
+            </w:r>
+          </w:p>
+        </w:tc>
+        <w:tc>
+          <w:tcPr>
+            <w:tcW w:w="0" w:type="auto"/>
+          </w:tcPr>
+          <w:p>
+            <w:r>
+              <w:t xml:space="preserve">No</w:t>
+            </w:r>
+          </w:p>
+        </w:tc>
+        <w:tc>
+          <w:tcPr>
+            <w:tcW w:w="0" w:type="auto"/>
+          </w:tcPr>
+          <w:p>
+            <w:r>
+              <w:t xml:space="preserve">Yes (Phase 3)</w:t>
+            </w:r>
+          </w:p>
+        </w:tc>
+      </w:tr>
+      <w:tr>
+        <w:tc>
+          <w:tcPr>
+            <w:tcW w:w="0" w:type="auto"/>
+          </w:tcPr>
+          <w:p>
+            <w:r>
+              <w:t xml:space="preserve">Top-up credits</w:t>
+            </w:r>
+          </w:p>
+        </w:tc>
+        <w:tc>
+          <w:tcPr>
+            <w:tcW w:w="0" w:type="auto"/>
+          </w:tcPr>
+          <w:p>
+            <w:r>
+              <w:t xml:space="preserve">Yes</w:t>
+            </w:r>
+          </w:p>
+        </w:tc>
+        <w:tc>
+          <w:tcPr>
+            <w:tcW w:w="0" w:type="auto"/>
+          </w:tcPr>
+          <w:p>
+            <w:r>
+              <w:t xml:space="preserve">Yes</w:t>
+            </w:r>
+          </w:p>
+        </w:tc>
+        <w:tc>
+          <w:tcPr>
+            <w:tcW w:w="0" w:type="auto"/>
+          </w:tcPr>
+          <w:p>
+            <w:r>
+              <w:t xml:space="preserve">Yes</w:t>
+            </w:r>
+          </w:p>
+        </w:tc>
+      </w:tr>
+      <w:tr>
+        <w:tc>
+          <w:tcPr>
+            <w:tcW w:w="0" w:type="auto"/>
+          </w:tcPr>
+          <w:p>
+            <w:r>
+              <w:t xml:space="preserve">Support</w:t>
+            </w:r>
+          </w:p>
+        </w:tc>
+        <w:tc>
+          <w:tcPr>
+            <w:tcW w:w="0" w:type="auto"/>
+          </w:tcPr>
+          <w:p>
+            <w:r>
+              <w:t xml:space="preserve">Standard</w:t>
+            </w:r>
+          </w:p>
+        </w:tc>
+        <w:tc>
+          <w:tcPr>
+            <w:tcW w:w="0" w:type="auto"/>
+          </w:tcPr>
+          <w:p>
+            <w:r>
+              <w:t xml:space="preserve">Priority</w:t>
+            </w:r>
+          </w:p>
+        </w:tc>
+        <w:tc>
+          <w:tcPr>
+            <w:tcW w:w="0" w:type="auto"/>
+          </w:tcPr>
+          <w:p>
+            <w:r>
+              <w:t xml:space="preserve">Priority + onboarding</w:t>
+            </w:r>
+          </w:p>
+        </w:tc>
+      </w:tr>
+    </w:tbl>
+    <w:p/>
+    <w:p>
+      <w:pPr>
+        <w:pStyle w:val="Heading2"/>
+      </w:pPr>
+      <w:r>
+        <w:t xml:space="preserve">4. Billing model (simple, hybrid)</w:t>
+      </w:r>
+    </w:p>
+    <w:p>
+      <w:pPr>
+        <w:numPr>
+          <w:ilvl w:val="0"/>
+          <w:numId w:val="1"/>
+        </w:numPr>
+      </w:pPr>
+      <w:r>
+        <w:rPr>
+          <w:b/>
+        </w:rPr>
+        <w:t xml:space="preserve">Flat monthly fee per tier</w:t>
+      </w:r>
+      <w:r>
+        <w:t xml:space="preserve"> (above), billed by Stripe.</w:t>
+      </w:r>
+    </w:p>
+    <w:p>
+      <w:pPr>
+        <w:numPr>
+          <w:ilvl w:val="0"/>
+          <w:numId w:val="1"/>
+        </w:numPr>
+      </w:pPr>
+      <w:r>
+        <w:rPr>
+          <w:b/>
+        </w:rPr>
+        <w:t xml:space="preserve">A fair-use AI allowance per tier</w:t>
+      </w:r>
+      <w:r>
+        <w:t xml:space="preserve"> (a number of mockups / live sites per month), so heavy users do not drain costs. Beyond it, cheap </w:t>
+      </w:r>
+      <w:r>
+        <w:rPr>
+          <w:b/>
+        </w:rPr>
+        <w:t xml:space="preserve">top-up credits</w:t>
+      </w:r>
+      <w:r>
+        <w:t xml:space="preserve"> (for example £12 for 50 extra mockups).</w:t>
+      </w:r>
+    </w:p>
+    <w:p>
+      <w:pPr>
+        <w:numPr>
+          <w:ilvl w:val="0"/>
+          <w:numId w:val="1"/>
+        </w:numPr>
+      </w:pPr>
+      <w:r>
+        <w:rPr>
+          <w:b/>
+        </w:rPr>
+        <w:t xml:space="preserve">Customers see "credits remaining", never raw API cost.</w:t>
+      </w:r>
+      <w:r>
+        <w:t xml:space="preserve"> The £ cost meter we built stays, but for you and Super Admin only.</w:t>
+      </w:r>
+    </w:p>
+    <w:p>
+      <w:pPr>
+        <w:numPr>
+          <w:ilvl w:val="0"/>
+          <w:numId w:val="1"/>
+        </w:numPr>
+      </w:pPr>
+      <w:r>
+        <w:rPr>
+          <w:b/>
+        </w:rPr>
+        <w:t xml:space="preserve">Annual option</w:t>
+      </w:r>
+      <w:r>
+        <w:t xml:space="preserve"> with two months free (improves cash flow, cuts churn).</w:t>
+      </w:r>
+    </w:p>
+    <w:p>
+      <w:pPr>
+        <w:numPr>
+          <w:ilvl w:val="0"/>
+          <w:numId w:val="1"/>
+        </w:numPr>
+      </w:pPr>
+      <w:r>
+        <w:rPr>
+          <w:b/>
+        </w:rPr>
+        <w:t xml:space="preserve">Founding members:</w:t>
+      </w:r>
+      <w:r>
+        <w:t xml:space="preserve"> the first 20 to 50 keep their rate </w:t>
+      </w:r>
+      <w:r>
+        <w:rPr>
+          <w:b/>
+        </w:rPr>
+        <w:t xml:space="preserve">for life</w:t>
+      </w:r>
+      <w:r>
+        <w:t xml:space="preserve"> in exchange for being case studies. Honour it permanently.</w:t>
+      </w:r>
+    </w:p>
+    <w:p>
+      <w:pPr>
+        <w:pStyle w:val="Heading2"/>
+      </w:pPr>
+      <w:r>
+        <w:t xml:space="preserve">5. Phase 1, Launch (get it out there, start charging, learn)</w:t>
+      </w:r>
+    </w:p>
+    <w:p>
+      <w:r>
+        <w:t xml:space="preserve">Goal: ship a payable product fast, prove people pay, see how they use it.</w:t>
+      </w:r>
+    </w:p>
+    <w:p>
+      <w:pPr>
+        <w:numPr>
+          <w:ilvl w:val="0"/>
+          <w:numId w:val="1"/>
+        </w:numPr>
+      </w:pPr>
+      <w:r>
+        <w:rPr>
+          <w:b/>
+        </w:rPr>
+        <w:t xml:space="preserve">Accounts:</w:t>
+      </w:r>
+      <w:r>
+        <w:t xml:space="preserve"> sign-up + login with </w:t>
+      </w:r>
+      <w:r>
+        <w:rPr>
+          <w:b/>
+        </w:rPr>
+        <w:t xml:space="preserve">Email and Google</w:t>
+      </w:r>
+      <w:r>
+        <w:t xml:space="preserve"> (Clerk).</w:t>
+      </w:r>
+    </w:p>
+    <w:p>
+      <w:pPr>
+        <w:numPr>
+          <w:ilvl w:val="0"/>
+          <w:numId w:val="1"/>
+        </w:numPr>
+      </w:pPr>
+      <w:r>
+        <w:rPr>
+          <w:b/>
+        </w:rPr>
+        <w:t xml:space="preserve">Payments:</w:t>
+      </w:r>
+      <w:r>
+        <w:t xml:space="preserve"> </w:t>
+      </w:r>
+      <w:r>
+        <w:rPr>
+          <w:b/>
+        </w:rPr>
+        <w:t xml:space="preserve">Stripe</w:t>
+      </w:r>
+      <w:r>
+        <w:t xml:space="preserve"> subscriptions for the 3 tiers, in £ and $. </w:t>
+      </w:r>
+      <w:r>
+        <w:rPr>
+          <w:b/>
+        </w:rPr>
+        <w:t xml:space="preserve">No free trial at launch</w:t>
+      </w:r>
+      <w:r>
+        <w:t xml:space="preserve"> (we can add one later); the founding-member offer carries the early risk-reversal.</w:t>
+      </w:r>
+    </w:p>
+    <w:p>
+      <w:pPr>
+        <w:numPr>
+          <w:ilvl w:val="0"/>
+          <w:numId w:val="1"/>
+        </w:numPr>
+      </w:pPr>
+      <w:r>
+        <w:rPr>
+          <w:b/>
+        </w:rPr>
+        <w:t xml:space="preserve">Per-customer data separation:</w:t>
+      </w:r>
+      <w:r>
+        <w:t xml:space="preserve"> each account only sees its own leads, mockups, sites, searches.</w:t>
+      </w:r>
+    </w:p>
+    <w:p>
+      <w:pPr>
+        <w:numPr>
+          <w:ilvl w:val="0"/>
+          <w:numId w:val="1"/>
+        </w:numPr>
+      </w:pPr>
+      <w:r>
+        <w:rPr>
+          <w:b/>
+        </w:rPr>
+        <w:t xml:space="preserve">Feature gating by plan:</w:t>
+      </w:r>
+      <w:r>
+        <w:t xml:space="preserve"> mockups locked to Hunter+, the live website builder locked to Apex.</w:t>
+      </w:r>
+    </w:p>
+    <w:p>
+      <w:pPr>
+        <w:numPr>
+          <w:ilvl w:val="0"/>
+          <w:numId w:val="1"/>
+        </w:numPr>
+      </w:pPr>
+      <w:r>
+        <w:rPr>
+          <w:b/>
+        </w:rPr>
+        <w:t xml:space="preserve">Credits, not raw cost,</w:t>
+      </w:r>
+      <w:r>
+        <w:t xml:space="preserve"> shown to customers.</w:t>
+      </w:r>
+    </w:p>
+    <w:p>
+      <w:pPr>
+        <w:numPr>
+          <w:ilvl w:val="0"/>
+          <w:numId w:val="1"/>
+        </w:numPr>
+      </w:pPr>
+      <w:r>
+        <w:rPr>
+          <w:b/>
+        </w:rPr>
+        <w:t xml:space="preserve">New light homepage + rebrand + new logo</w:t>
+      </w:r>
+      <w:r>
+        <w:t xml:space="preserve"> (see section 8).</w:t>
+      </w:r>
+    </w:p>
+    <w:p>
+      <w:pPr>
+        <w:numPr>
+          <w:ilvl w:val="0"/>
+          <w:numId w:val="1"/>
+        </w:numPr>
+      </w:pPr>
+      <w:r>
+        <w:rPr>
+          <w:b/>
+        </w:rPr>
+        <w:t xml:space="preserve">Minimal Super Admin:</w:t>
+      </w:r>
+      <w:r>
+        <w:t xml:space="preserve"> list customers, their tier, basic usage counts, suspend or change tier by hand.</w:t>
+      </w:r>
+    </w:p>
+    <w:p>
+      <w:pPr>
+        <w:numPr>
+          <w:ilvl w:val="0"/>
+          <w:numId w:val="1"/>
+        </w:numPr>
+      </w:pPr>
+      <w:r>
+        <w:rPr>
+          <w:b/>
+        </w:rPr>
+        <w:t xml:space="preserve">Founding-member offer</w:t>
+      </w:r>
+      <w:r>
+        <w:t xml:space="preserve"> wired to the existing apply funnel, with the lifetime grandfather.</w:t>
+      </w:r>
+    </w:p>
+    <w:p>
+      <w:pPr>
+        <w:pStyle w:val="Heading2"/>
+      </w:pPr>
+      <w:r>
+        <w:t xml:space="preserve">6. Phase 2, Grow (monetise deeper, understand customers)</w:t>
+      </w:r>
+    </w:p>
+    <w:p>
+      <w:pPr>
+        <w:numPr>
+          <w:ilvl w:val="0"/>
+          <w:numId w:val="1"/>
+        </w:numPr>
+      </w:pPr>
+      <w:r>
+        <w:rPr>
+          <w:b/>
+        </w:rPr>
+        <w:t xml:space="preserve">Super Admin analytics (PostHog + dashboards):</w:t>
+      </w:r>
+      <w:r>
+        <w:t xml:space="preserve"> what customers search for, their funnel (messaged to viewed to won), most-used features, churn and upsell signals.</w:t>
+      </w:r>
+    </w:p>
+    <w:p>
+      <w:pPr>
+        <w:numPr>
+          <w:ilvl w:val="0"/>
+          <w:numId w:val="1"/>
+        </w:numPr>
+      </w:pPr>
+      <w:r>
+        <w:rPr>
+          <w:b/>
+        </w:rPr>
+        <w:t xml:space="preserve">Usage limits enforced per tier + "upgrade to unlock"</w:t>
+      </w:r>
+      <w:r>
+        <w:t xml:space="preserve"> prompts.</w:t>
+      </w:r>
+    </w:p>
+    <w:p>
+      <w:pPr>
+        <w:numPr>
+          <w:ilvl w:val="0"/>
+          <w:numId w:val="1"/>
+        </w:numPr>
+      </w:pPr>
+      <w:r>
+        <w:rPr>
+          <w:b/>
+        </w:rPr>
+        <w:t xml:space="preserve">Top-up credits + annual billing + referrals.</w:t>
+      </w:r>
+    </w:p>
+    <w:p>
+      <w:pPr>
+        <w:numPr>
+          <w:ilvl w:val="0"/>
+          <w:numId w:val="1"/>
+        </w:numPr>
+      </w:pPr>
+      <w:r>
+        <w:rPr>
+          <w:b/>
+        </w:rPr>
+        <w:t xml:space="preserve">Close feature gaps versus rivals:</w:t>
+      </w:r>
+      <w:r>
+        <w:t xml:space="preserve"> email enrichment (find an email), and a </w:t>
+      </w:r>
+      <w:r>
+        <w:rPr>
+          <w:b/>
+        </w:rPr>
+        <w:t xml:space="preserve">Facebook lead source</w:t>
+      </w:r>
+      <w:r>
+        <w:t xml:space="preserve"> (LeadsGorilla has it, we do not yet).</w:t>
+      </w:r>
+    </w:p>
+    <w:p>
+      <w:pPr>
+        <w:numPr>
+          <w:ilvl w:val="0"/>
+          <w:numId w:val="1"/>
+        </w:numPr>
+      </w:pPr>
+      <w:r>
+        <w:t xml:space="preserve">Tighten the founding cohort into testimonials and case studies.</w:t>
+      </w:r>
+    </w:p>
+    <w:p>
+      <w:pPr>
+        <w:pStyle w:val="Heading2"/>
+      </w:pPr>
+      <w:r>
+        <w:t xml:space="preserve">7. Phase 3, Scale (build the moat)</w:t>
+      </w:r>
+    </w:p>
+    <w:p>
+      <w:pPr>
+        <w:numPr>
+          <w:ilvl w:val="0"/>
+          <w:numId w:val="1"/>
+        </w:numPr>
+      </w:pPr>
+      <w:r>
+        <w:rPr>
+          <w:b/>
+        </w:rPr>
+        <w:t xml:space="preserve">Full white-label:</w:t>
+      </w:r>
+      <w:r>
+        <w:t xml:space="preserve"> per-account branding, the customer's own agency name and colours everywhere, custom domains for previews and live sites.</w:t>
+      </w:r>
+    </w:p>
+    <w:p>
+      <w:pPr>
+        <w:numPr>
+          <w:ilvl w:val="0"/>
+          <w:numId w:val="1"/>
+        </w:numPr>
+      </w:pPr>
+      <w:r>
+        <w:rPr>
+          <w:b/>
+        </w:rPr>
+        <w:t xml:space="preserve">Team seats + roles</w:t>
+      </w:r>
+      <w:r>
+        <w:t xml:space="preserve"> (agencies with staff).</w:t>
+      </w:r>
+    </w:p>
+    <w:p>
+      <w:pPr>
+        <w:numPr>
+          <w:ilvl w:val="0"/>
+          <w:numId w:val="1"/>
+        </w:numPr>
+      </w:pPr>
+      <w:r>
+        <w:rPr>
+          <w:b/>
+        </w:rPr>
+        <w:t xml:space="preserve">Integrations:</w:t>
+      </w:r>
+      <w:r>
+        <w:t xml:space="preserve"> GoHighLevel, Zapier, a public API / webhooks.</w:t>
+      </w:r>
+    </w:p>
+    <w:p>
+      <w:pPr>
+        <w:numPr>
+          <w:ilvl w:val="0"/>
+          <w:numId w:val="1"/>
+        </w:numPr>
+      </w:pPr>
+      <w:r>
+        <w:rPr>
+          <w:b/>
+        </w:rPr>
+        <w:t xml:space="preserve">Done-for-you / marketplace</w:t>
+      </w:r>
+      <w:r>
+        <w:t xml:space="preserve"> add-ons for extra revenue (for example paid lead packs or managed campaigns).</w:t>
+      </w:r>
+    </w:p>
+    <w:p>
+      <w:pPr>
+        <w:numPr>
+          <w:ilvl w:val="0"/>
+          <w:numId w:val="1"/>
+        </w:numPr>
+      </w:pPr>
+      <w:r>
+        <w:t xml:space="preserve">Advanced AI: auto-outreach sequences, smarter follow-ups.</w:t>
+      </w:r>
+    </w:p>
+    <w:p>
+      <w:pPr>
+        <w:pStyle w:val="Heading2"/>
+      </w:pPr>
+      <w:r>
+        <w:t xml:space="preserve">8. Phase 1 brand + homepage refresh</w:t>
+      </w:r>
+    </w:p>
+    <w:p>
+      <w:pPr>
+        <w:pStyle w:val="Heading3"/>
+      </w:pPr>
+      <w:r>
+        <w:t xml:space="preserve">New homepage (simpler, lighter, ScrollyVid style)</w:t>
+      </w:r>
+    </w:p>
+    <w:p>
+      <w:pPr>
+        <w:numPr>
+          <w:ilvl w:val="0"/>
+          <w:numId w:val="1"/>
+        </w:numPr>
+      </w:pPr>
+      <w:r>
+        <w:t xml:space="preserve">A clean, </w:t>
+      </w:r>
+      <w:r>
+        <w:rPr>
+          <w:b/>
+        </w:rPr>
+        <w:t xml:space="preserve">light</w:t>
+      </w:r>
+      <w:r>
+        <w:t xml:space="preserve"> hero with the </w:t>
+      </w:r>
+      <w:r>
+        <w:rPr>
+          <w:b/>
+        </w:rPr>
+        <w:t xml:space="preserve">search front and centre and emphasised</w:t>
+      </w:r>
+      <w:r>
+        <w:t xml:space="preserve">, three simple fields:</w:t>
+      </w:r>
+    </w:p>
+    <w:p>
+      <w:pPr>
+        <w:numPr>
+          <w:ilvl w:val="0"/>
+          <w:numId w:val="1"/>
+        </w:numPr>
+      </w:pPr>
+      <w:r>
+        <w:rPr>
+          <w:b/>
+        </w:rPr>
+        <w:t xml:space="preserve">I am looking for</w:t>
+      </w:r>
+      <w:r>
+        <w:t xml:space="preserve"> (business type, for example electricians)</w:t>
+      </w:r>
+    </w:p>
+    <w:p>
+      <w:pPr>
+        <w:numPr>
+          <w:ilvl w:val="0"/>
+          <w:numId w:val="1"/>
+        </w:numPr>
+      </w:pPr>
+      <w:r>
+        <w:rPr>
+          <w:b/>
+        </w:rPr>
+        <w:t xml:space="preserve">Location</w:t>
+      </w:r>
+    </w:p>
+    <w:p>
+      <w:pPr>
+        <w:numPr>
+          <w:ilvl w:val="0"/>
+          <w:numId w:val="1"/>
+        </w:numPr>
+      </w:pPr>
+      <w:r>
+        <w:rPr>
+          <w:b/>
+        </w:rPr>
+        <w:t xml:space="preserve">Quick targeting toggles:</w:t>
+      </w:r>
+      <w:r>
+        <w:t xml:space="preserve"> "has a phone", "no website"</w:t>
+      </w:r>
+    </w:p>
+    <w:p>
+      <w:pPr>
+        <w:numPr>
+          <w:ilvl w:val="0"/>
+          <w:numId w:val="1"/>
+        </w:numPr>
+      </w:pPr>
+      <w:r>
+        <w:t xml:space="preserve">A big </w:t>
+      </w:r>
+      <w:r>
+        <w:rPr>
+          <w:b/>
+        </w:rPr>
+        <w:t xml:space="preserve">Find leads</w:t>
+      </w:r>
+      <w:r>
+        <w:t xml:space="preserve"> button</w:t>
+      </w:r>
+    </w:p>
+    <w:p>
+      <w:pPr>
+        <w:numPr>
+          <w:ilvl w:val="0"/>
+          <w:numId w:val="1"/>
+        </w:numPr>
+      </w:pPr>
+      <w:r>
+        <w:t xml:space="preserve">Below the hero: the value proposition (find no-website businesses, show them a website you built), a few proof points, the pricing, and sign-up. Logged-out visitors get a teaser then a prompt to start a free trial.</w:t>
+      </w:r>
+    </w:p>
+    <w:p>
+      <w:pPr>
+        <w:pStyle w:val="Heading3"/>
+      </w:pPr>
+      <w:r>
+        <w:t xml:space="preserve">Branding</w:t>
+      </w:r>
+    </w:p>
+    <w:p>
+      <w:pPr>
+        <w:numPr>
+          <w:ilvl w:val="0"/>
+          <w:numId w:val="1"/>
+        </w:numPr>
+      </w:pPr>
+      <w:r>
+        <w:rPr>
+          <w:b/>
+        </w:rPr>
+        <w:t xml:space="preserve">Default theme switches to LIGHT</w:t>
+      </w:r>
+      <w:r>
+        <w:t xml:space="preserve"> (today it is dark navy + gradients): bright, clean, professional.</w:t>
+      </w:r>
+    </w:p>
+    <w:p>
+      <w:pPr>
+        <w:numPr>
+          <w:ilvl w:val="0"/>
+          <w:numId w:val="1"/>
+        </w:numPr>
+      </w:pPr>
+      <w:r>
+        <w:t xml:space="preserve">Add a </w:t>
+      </w:r>
+      <w:r>
+        <w:rPr>
+          <w:b/>
+        </w:rPr>
+        <w:t xml:space="preserve">light / dark toggle</w:t>
+      </w:r>
+      <w:r>
+        <w:t xml:space="preserve">, default </w:t>
+      </w:r>
+      <w:r>
+        <w:rPr>
+          <w:b/>
+        </w:rPr>
+        <w:t xml:space="preserve">light</w:t>
+      </w:r>
+      <w:r>
+        <w:t xml:space="preserve">, the choice is remembered per user.</w:t>
+      </w:r>
+    </w:p>
+    <w:p>
+      <w:pPr>
+        <w:numPr>
+          <w:ilvl w:val="0"/>
+          <w:numId w:val="1"/>
+        </w:numPr>
+      </w:pPr>
+      <w:r>
+        <w:t xml:space="preserve">A fresh, </w:t>
+      </w:r>
+      <w:r>
+        <w:rPr>
+          <w:b/>
+        </w:rPr>
+        <w:t xml:space="preserve">flat accent colour</w:t>
+      </w:r>
+      <w:r>
+        <w:t xml:space="preserve"> (not the blue to mauve gradient).</w:t>
+      </w:r>
+    </w:p>
+    <w:p>
+      <w:pPr>
+        <w:pStyle w:val="Heading3"/>
+      </w:pPr>
+      <w:r>
+        <w:t xml:space="preserve">New logo, CONFIRMED direction: Option A</w:t>
+      </w:r>
+    </w:p>
+    <w:p>
+      <w:pPr>
+        <w:numPr>
+          <w:ilvl w:val="0"/>
+          <w:numId w:val="1"/>
+        </w:numPr>
+      </w:pPr>
+      <w:r>
+        <w:t xml:space="preserve">A </w:t>
+      </w:r>
+      <w:r>
+        <w:rPr>
+          <w:b/>
+        </w:rPr>
+        <w:t xml:space="preserve">flat, distinctive mark, not the typical gradient AI logo.</w:t>
+      </w:r>
+    </w:p>
+    <w:p>
+      <w:pPr>
+        <w:numPr>
+          <w:ilvl w:val="0"/>
+          <w:numId w:val="1"/>
+        </w:numPr>
+      </w:pPr>
+      <w:r>
+        <w:rPr>
+          <w:b/>
+        </w:rPr>
+        <w:t xml:space="preserve">Option A chosen:</w:t>
+      </w:r>
+      <w:r>
+        <w:t xml:space="preserve"> a clean geometric </w:t>
+      </w:r>
+      <w:r>
+        <w:rPr>
+          <w:b/>
+        </w:rPr>
+        <w:t xml:space="preserve">pounce</w:t>
+      </w:r>
+      <w:r>
+        <w:t xml:space="preserve"> mark, a stylised paw fused with a location pin (lead-gen meets pounce). I will mock a few variants of this to pick from.</w:t>
+      </w:r>
+    </w:p>
+    <w:p>
+      <w:pPr>
+        <w:numPr>
+          <w:ilvl w:val="0"/>
+          <w:numId w:val="1"/>
+        </w:numPr>
+      </w:pPr>
+      <w:r>
+        <w:t xml:space="preserve">Must work in light and dark and shrink to a favicon.</w:t>
+      </w:r>
+    </w:p>
+    <w:p>
+      <w:pPr>
+        <w:pStyle w:val="Heading3"/>
+      </w:pPr>
+      <w:r>
+        <w:t xml:space="preserve">Colours, CONFIRMED direction</w:t>
+      </w:r>
+    </w:p>
+    <w:p>
+      <w:pPr>
+        <w:numPr>
+          <w:ilvl w:val="0"/>
+          <w:numId w:val="1"/>
+        </w:numPr>
+      </w:pPr>
+      <w:r>
+        <w:rPr>
+          <w:b/>
+        </w:rPr>
+        <w:t xml:space="preserve">Bright, positive, happy, flat colours. No gradients. Distinctive.</w:t>
+      </w:r>
+      <w:r>
+        <w:t xml:space="preserve"> (Today's blue-to-mauve gradient goes.)</w:t>
+      </w:r>
+    </w:p>
+    <w:p>
+      <w:pPr>
+        <w:numPr>
+          <w:ilvl w:val="0"/>
+          <w:numId w:val="1"/>
+        </w:numPr>
+      </w:pPr>
+      <w:r>
+        <w:t xml:space="preserve">A bold primary plus one or two cheerful accents, on light backgrounds, clearly different from LeadsGorilla's yellow/purple.</w:t>
+      </w:r>
+    </w:p>
+    <w:p>
+      <w:pPr>
+        <w:pStyle w:val="Heading2"/>
+      </w:pPr>
+      <w:r>
+        <w:t xml:space="preserve">9. Feature map by phase</w:t>
+      </w:r>
+    </w:p>
+    <w:tbl>
+      <w:tblPr>
+        <w:tblW w:w="5000" w:type="pct"/>
+        <w:tblBorders>
+          <w:top w:val="single" w:sz="4" w:color="CCCCCC"/>
+          <w:left w:val="single" w:sz="4" w:color="CCCCCC"/>
+          <w:bottom w:val="single" w:sz="4" w:color="CCCCCC"/>
+          <w:right w:val="single" w:sz="4" w:color="CCCCCC"/>
+          <w:insideH w:val="single" w:sz="4" w:color="CCCCCC"/>
+          <w:insideV w:val="single" w:sz="4" w:color="CCCCCC"/>
+        </w:tblBorders>
+        <w:tblLook w:firstRow="1"/>
+      </w:tblPr>
+      <w:tr>
+        <w:tc>
+          <w:tcPr>
+            <w:tcW w:w="0" w:type="auto"/>
+            <w:shd w:val="clear" w:fill="F0F2F5"/>
+          </w:tcPr>
+          <w:p>
+            <w:r>
+              <w:rPr>
+                <w:b/>
+              </w:rPr>
               <w:t xml:space="preserve">Capability</w:t>
             </w:r>
           </w:p>
@@ -2418,97 +3045,189 @@
         <w:pStyle w:val="Heading2"/>
       </w:pPr>
       <w:r>
-        <w:t xml:space="preserve">10. Decisions I need from you before we build</w:t>
-      </w:r>
-    </w:p>
-    <w:p>
-      <w:pPr>
-        <w:numPr>
-          <w:ilvl w:val="0"/>
-          <w:numId w:val="1"/>
-        </w:numPr>
-      </w:pPr>
-      <w:r>
-        <w:rPr>
-          <w:b/>
-        </w:rPr>
-        <w:t xml:space="preserve">Auth platform:</w:t>
-      </w:r>
-      <w:r>
-        <w:t xml:space="preserve"> Clerk (my pick, least disruption) or Supabase (one backend, like ScrollyVid)?</w:t>
-      </w:r>
-    </w:p>
-    <w:p>
-      <w:pPr>
-        <w:numPr>
-          <w:ilvl w:val="0"/>
-          <w:numId w:val="1"/>
-        </w:numPr>
-      </w:pPr>
-      <w:r>
-        <w:rPr>
-          <w:b/>
-        </w:rPr>
-        <w:t xml:space="preserve">Prices:</w:t>
-      </w:r>
-      <w:r>
-        <w:t xml:space="preserve"> happy with the proposed tiers, or adjust?</w:t>
-      </w:r>
-    </w:p>
-    <w:p>
-      <w:pPr>
-        <w:numPr>
-          <w:ilvl w:val="0"/>
-          <w:numId w:val="1"/>
-        </w:numPr>
-      </w:pPr>
-      <w:r>
-        <w:rPr>
-          <w:b/>
-        </w:rPr>
-        <w:t xml:space="preserve">Trial:</w:t>
-      </w:r>
-      <w:r>
-        <w:t xml:space="preserve"> time-based (7 days) or usage-based ("25 leads + 3 mockups free")?</w:t>
-      </w:r>
-    </w:p>
-    <w:p>
-      <w:pPr>
-        <w:numPr>
-          <w:ilvl w:val="0"/>
-          <w:numId w:val="1"/>
-        </w:numPr>
-      </w:pPr>
-      <w:r>
-        <w:rPr>
-          <w:b/>
-        </w:rPr>
-        <w:t xml:space="preserve">Logo direction:</w:t>
-      </w:r>
-      <w:r>
-        <w:t xml:space="preserve"> A, B or C above (I will mock options once you pick a lean).</w:t>
-      </w:r>
-    </w:p>
-    <w:p>
-      <w:pPr>
-        <w:numPr>
-          <w:ilvl w:val="0"/>
-          <w:numId w:val="1"/>
-        </w:numPr>
-      </w:pPr>
-      <w:r>
-        <w:rPr>
-          <w:b/>
-        </w:rPr>
-        <w:t xml:space="preserve">Theme accent colour:</w:t>
-      </w:r>
-      <w:r>
-        <w:t xml:space="preserve"> any preference, or shall I propose a couple?</w:t>
-      </w:r>
-    </w:p>
-    <w:p>
-      <w:r>
-        <w:t xml:space="preserve">When you have read this and are happy, say go and I will (1) create the build tracker, then (2) start Phase 1. The tracker is deliberately not created yet, since you may want changes.</w:t>
+        <w:t xml:space="preserve">10. Decisions, status</w:t>
+      </w:r>
+    </w:p>
+    <w:tbl>
+      <w:tblPr>
+        <w:tblW w:w="5000" w:type="pct"/>
+        <w:tblBorders>
+          <w:top w:val="single" w:sz="4" w:color="CCCCCC"/>
+          <w:left w:val="single" w:sz="4" w:color="CCCCCC"/>
+          <w:bottom w:val="single" w:sz="4" w:color="CCCCCC"/>
+          <w:right w:val="single" w:sz="4" w:color="CCCCCC"/>
+          <w:insideH w:val="single" w:sz="4" w:color="CCCCCC"/>
+          <w:insideV w:val="single" w:sz="4" w:color="CCCCCC"/>
+        </w:tblBorders>
+        <w:tblLook w:firstRow="1"/>
+      </w:tblPr>
+      <w:tr>
+        <w:tc>
+          <w:tcPr>
+            <w:tcW w:w="0" w:type="auto"/>
+            <w:shd w:val="clear" w:fill="F0F2F5"/>
+          </w:tcPr>
+          <w:p>
+            <w:r>
+              <w:rPr>
+                <w:b/>
+              </w:rPr>
+              <w:t xml:space="preserve">Decision</w:t>
+            </w:r>
+          </w:p>
+        </w:tc>
+        <w:tc>
+          <w:tcPr>
+            <w:tcW w:w="0" w:type="auto"/>
+            <w:shd w:val="clear" w:fill="F0F2F5"/>
+          </w:tcPr>
+          <w:p>
+            <w:r>
+              <w:rPr>
+                <w:b/>
+              </w:rPr>
+              <w:t xml:space="preserve">Status</w:t>
+            </w:r>
+          </w:p>
+        </w:tc>
+      </w:tr>
+      <w:tr>
+        <w:tc>
+          <w:tcPr>
+            <w:tcW w:w="0" w:type="auto"/>
+          </w:tcPr>
+          <w:p>
+            <w:r>
+              <w:t xml:space="preserve">Prices</w:t>
+            </w:r>
+          </w:p>
+        </w:tc>
+        <w:tc>
+          <w:tcPr>
+            <w:tcW w:w="0" w:type="auto"/>
+          </w:tcPr>
+          <w:p>
+            <w:r>
+              <w:t xml:space="preserve">Confirmed (as proposed, kept in config so editable)</w:t>
+            </w:r>
+          </w:p>
+        </w:tc>
+      </w:tr>
+      <w:tr>
+        <w:tc>
+          <w:tcPr>
+            <w:tcW w:w="0" w:type="auto"/>
+          </w:tcPr>
+          <w:p>
+            <w:r>
+              <w:t xml:space="preserve">Free trial</w:t>
+            </w:r>
+          </w:p>
+        </w:tc>
+        <w:tc>
+          <w:tcPr>
+            <w:tcW w:w="0" w:type="auto"/>
+          </w:tcPr>
+          <w:p>
+            <w:r>
+              <w:t xml:space="preserve">Confirmed: none at launch</w:t>
+            </w:r>
+          </w:p>
+        </w:tc>
+      </w:tr>
+      <w:tr>
+        <w:tc>
+          <w:tcPr>
+            <w:tcW w:w="0" w:type="auto"/>
+          </w:tcPr>
+          <w:p>
+            <w:r>
+              <w:t xml:space="preserve">Logo</w:t>
+            </w:r>
+          </w:p>
+        </w:tc>
+        <w:tc>
+          <w:tcPr>
+            <w:tcW w:w="0" w:type="auto"/>
+          </w:tcPr>
+          <w:p>
+            <w:r>
+              <w:t xml:space="preserve">Confirmed: Option A (paw + pin)</w:t>
+            </w:r>
+          </w:p>
+        </w:tc>
+      </w:tr>
+      <w:tr>
+        <w:tc>
+          <w:tcPr>
+            <w:tcW w:w="0" w:type="auto"/>
+          </w:tcPr>
+          <w:p>
+            <w:r>
+              <w:t xml:space="preserve">Colours</w:t>
+            </w:r>
+          </w:p>
+        </w:tc>
+        <w:tc>
+          <w:tcPr>
+            <w:tcW w:w="0" w:type="auto"/>
+          </w:tcPr>
+          <w:p>
+            <w:r>
+              <w:t xml:space="preserve">Confirmed: bright, happy, flat, no gradients</w:t>
+            </w:r>
+          </w:p>
+        </w:tc>
+      </w:tr>
+      <w:tr>
+        <w:tc>
+          <w:tcPr>
+            <w:tcW w:w="0" w:type="auto"/>
+          </w:tcPr>
+          <w:p>
+            <w:r>
+              <w:t xml:space="preserve">Comparison table</w:t>
+            </w:r>
+          </w:p>
+        </w:tc>
+        <w:tc>
+          <w:tcPr>
+            <w:tcW w:w="0" w:type="auto"/>
+          </w:tcPr>
+          <w:p>
+            <w:r>
+              <w:t xml:space="preserve">Confirmed: include a LeadsGorilla-style feature table</w:t>
+            </w:r>
+          </w:p>
+        </w:tc>
+      </w:tr>
+      <w:tr>
+        <w:tc>
+          <w:tcPr>
+            <w:tcW w:w="0" w:type="auto"/>
+          </w:tcPr>
+          <w:p>
+            <w:r>
+              <w:t xml:space="preserve">Auth platform</w:t>
+            </w:r>
+          </w:p>
+        </w:tc>
+        <w:tc>
+          <w:tcPr>
+            <w:tcW w:w="0" w:type="auto"/>
+          </w:tcPr>
+          <w:p>
+            <w:r>
+              <w:t xml:space="preserve">Open: Clerk (my recommendation) vs Supabase, still to confirm</w:t>
+            </w:r>
+          </w:p>
+        </w:tc>
+      </w:tr>
+    </w:tbl>
+    <w:p/>
+    <w:p>
+      <w:r>
+        <w:t xml:space="preserve">When you are happy with the mocked logo and homepage, say go and I will (1) create the build tracker, then (2) start Phase 1. The tracker is deliberately not created yet, since you may still want changes.</w:t>
       </w:r>
     </w:p>
     <w:sectPr>

</xml_diff>

<commit_message>
Subscription proposal: lock logo (pin + bolt) + brand palette (teal/coral/amber, flat)
Co-Authored-By: Claude Opus 4.8 <noreply@anthropic.com>
</commit_message>
<xml_diff>
--- a/SUBSCRIPTION_PLAN.docx
+++ b/SUBSCRIPTION_PLAN.docx
@@ -2220,7 +2220,7 @@
         <w:pStyle w:val="Heading3"/>
       </w:pPr>
       <w:r>
-        <w:t xml:space="preserve">New logo, CONFIRMED direction: Option A</w:t>
+        <w:t xml:space="preserve">New logo, CONFIRMED: "Pin + bolt"</w:t>
       </w:r>
     </w:p>
     <w:p>
@@ -2237,44 +2237,73 @@
         <w:rPr>
           <w:b/>
         </w:rPr>
-        <w:t xml:space="preserve">flat, distinctive mark, not the typical gradient AI logo.</w:t>
-      </w:r>
-    </w:p>
-    <w:p>
-      <w:pPr>
-        <w:numPr>
-          <w:ilvl w:val="0"/>
-          <w:numId w:val="1"/>
-        </w:numPr>
-      </w:pPr>
-      <w:r>
-        <w:rPr>
-          <w:b/>
-        </w:rPr>
-        <w:t xml:space="preserve">Option A chosen:</w:t>
-      </w:r>
-      <w:r>
-        <w:t xml:space="preserve"> a clean geometric </w:t>
-      </w:r>
-      <w:r>
-        <w:rPr>
-          <w:b/>
-        </w:rPr>
-        <w:t xml:space="preserve">pounce</w:t>
-      </w:r>
-      <w:r>
-        <w:t xml:space="preserve"> mark, a stylised paw fused with a location pin (lead-gen meets pounce). I will mock a few variants of this to pick from.</w:t>
-      </w:r>
-    </w:p>
-    <w:p>
-      <w:pPr>
-        <w:numPr>
-          <w:ilvl w:val="0"/>
-          <w:numId w:val="1"/>
-        </w:numPr>
-      </w:pPr>
-      <w:r>
-        <w:t xml:space="preserve">Must work in light and dark and shrink to a favicon.</w:t>
+        <w:t xml:space="preserve">flat, distinctive, on-message mark</w:t>
+      </w:r>
+      <w:r>
+        <w:t xml:space="preserve"> (no animals, the audience must instantly read "find local businesses fast"):</w:t>
+      </w:r>
+    </w:p>
+    <w:p>
+      <w:r>
+        <w:t xml:space="preserve">a </w:t>
+      </w:r>
+      <w:r>
+        <w:rPr>
+          <w:b/>
+        </w:rPr>
+        <w:t xml:space="preserve">location pin</w:t>
+      </w:r>
+      <w:r>
+        <w:t xml:space="preserve"> (local lead-gen) with a </w:t>
+      </w:r>
+      <w:r>
+        <w:rPr>
+          <w:b/>
+        </w:rPr>
+        <w:t xml:space="preserve">lightning bolt</w:t>
+      </w:r>
+      <w:r>
+        <w:t xml:space="preserve"> inside it (pounce, speed).</w:t>
+      </w:r>
+    </w:p>
+    <w:p>
+      <w:pPr>
+        <w:numPr>
+          <w:ilvl w:val="0"/>
+          <w:numId w:val="1"/>
+        </w:numPr>
+      </w:pPr>
+      <w:r>
+        <w:t xml:space="preserve">Teal pin, white inner circle, coral bolt. Works on light and dark, shrinks to a favicon.</w:t>
+      </w:r>
+    </w:p>
+    <w:p>
+      <w:pPr>
+        <w:numPr>
+          <w:ilvl w:val="0"/>
+          <w:numId w:val="1"/>
+        </w:numPr>
+      </w:pPr>
+      <w:r>
+        <w:t xml:space="preserve">Wordmark lockup: </w:t>
+      </w:r>
+      <w:r>
+        <w:rPr>
+          <w:b/>
+        </w:rPr>
+        <w:t xml:space="preserve">Site</w:t>
+      </w:r>
+      <w:r>
+        <w:t xml:space="preserve"> in ink + </w:t>
+      </w:r>
+      <w:r>
+        <w:rPr>
+          <w:b/>
+        </w:rPr>
+        <w:t xml:space="preserve">Pounce</w:t>
+      </w:r>
+      <w:r>
+        <w:t xml:space="preserve"> in teal, with the strapline "Find. Show. Pounce."</w:t>
       </w:r>
     </w:p>
     <w:p>
@@ -2282,35 +2311,68 @@
         <w:pStyle w:val="Heading3"/>
       </w:pPr>
       <w:r>
-        <w:t xml:space="preserve">Colours, CONFIRMED direction</w:t>
-      </w:r>
-    </w:p>
-    <w:p>
-      <w:pPr>
-        <w:numPr>
-          <w:ilvl w:val="0"/>
-          <w:numId w:val="1"/>
-        </w:numPr>
-      </w:pPr>
-      <w:r>
-        <w:rPr>
-          <w:b/>
-        </w:rPr>
-        <w:t xml:space="preserve">Bright, positive, happy, flat colours. No gradients. Distinctive.</w:t>
-      </w:r>
-      <w:r>
-        <w:t xml:space="preserve"> (Today's blue-to-mauve gradient goes.)</w:t>
-      </w:r>
-    </w:p>
-    <w:p>
-      <w:pPr>
-        <w:numPr>
-          <w:ilvl w:val="0"/>
-          <w:numId w:val="1"/>
-        </w:numPr>
-      </w:pPr>
-      <w:r>
-        <w:t xml:space="preserve">A bold primary plus one or two cheerful accents, on light backgrounds, clearly different from LeadsGorilla's yellow/purple.</w:t>
+        <w:t xml:space="preserve">Colours, CONFIRMED</w:t>
+      </w:r>
+    </w:p>
+    <w:p>
+      <w:pPr>
+        <w:numPr>
+          <w:ilvl w:val="0"/>
+          <w:numId w:val="1"/>
+        </w:numPr>
+      </w:pPr>
+      <w:r>
+        <w:rPr>
+          <w:b/>
+        </w:rPr>
+        <w:t xml:space="preserve">Bright, flat, no gradients</w:t>
+      </w:r>
+      <w:r>
+        <w:t xml:space="preserve"> (the blue-to-mauve gradient goes).</w:t>
+      </w:r>
+    </w:p>
+    <w:p>
+      <w:pPr>
+        <w:numPr>
+          <w:ilvl w:val="0"/>
+          <w:numId w:val="1"/>
+        </w:numPr>
+      </w:pPr>
+      <w:r>
+        <w:rPr>
+          <w:b/>
+        </w:rPr>
+        <w:t xml:space="preserve">Primary teal `#0FB6A8`</w:t>
+      </w:r>
+      <w:r>
+        <w:t xml:space="preserve">, </w:t>
+      </w:r>
+      <w:r>
+        <w:rPr>
+          <w:b/>
+        </w:rPr>
+        <w:t xml:space="preserve">accent coral `#FF6B6B`</w:t>
+      </w:r>
+      <w:r>
+        <w:t xml:space="preserve">, </w:t>
+      </w:r>
+      <w:r>
+        <w:rPr>
+          <w:b/>
+        </w:rPr>
+        <w:t xml:space="preserve">highlight amber `#FFC233`</w:t>
+      </w:r>
+      <w:r>
+        <w:t xml:space="preserve">, </w:t>
+      </w:r>
+      <w:r>
+        <w:rPr>
+          <w:b/>
+        </w:rPr>
+        <w:t xml:space="preserve">ink `#15233B`</w:t>
+      </w:r>
+      <w:r>
+        <w:t xml:space="preserve">, on light backgrounds. Clearly different from LeadsGorilla's yellow/purple.</w:t>
       </w:r>
     </w:p>
     <w:p>
@@ -3152,7 +3214,7 @@
           </w:tcPr>
           <w:p>
             <w:r>
-              <w:t xml:space="preserve">Confirmed: Option A (paw + pin)</w:t>
+              <w:t xml:space="preserve">Confirmed: "pin + bolt" (location pin + lightning)</w:t>
             </w:r>
           </w:p>
         </w:tc>
@@ -3174,7 +3236,7 @@
           </w:tcPr>
           <w:p>
             <w:r>
-              <w:t xml:space="preserve">Confirmed: bright, happy, flat, no gradients</w:t>
+              <w:t xml:space="preserve">Confirmed: teal #0FB6A8 + coral #FF6B6B + amber #FFC233, flat, no gradients</w:t>
             </w:r>
           </w:p>
         </w:tc>

</xml_diff>